<commit_message>
Record completed ASI:One mock demonstration
</commit_message>
<xml_diff>
--- a/deliverables/ServiceSetu_Changes_and_Handoff.docx
+++ b/deliverables/ServiceSetu_Changes_and_Handoff.docx
@@ -12,15 +12,12 @@
     </w:p>
     <w:p>
       <w:r>
-        <w:rPr>
-          <w:color w:val="5A6978"/>
-        </w:rPr>
-        <w:t>23 October 2026  ·  Existing ServiceSetu repository  ·  Local changes only</w:t>
+        <w:t>Final update 23 October 2026  ·  Existing ServiceSetu repository</w:t>
       </w:r>
     </w:p>
     <w:p>
       <w:r>
-        <w:t>This handoff lists the implementation, evidence, exact demo steps, payment setup, current live blockers and operator responsibilities. It contains no credentials, private seed, access token or customer data.</w:t>
+        <w:t>This handoff records the implementation, verified tests, successful signed-in ASI:One mock demonstration, shareable conversation, setup steps, remaining payment limits and pilot responsibilities. The chat uses only fictional demo providers and synthetic booking details. This local copy contains a private conversation link; it is not included in the pushed commit.</w:t>
       </w:r>
     </w:p>
     <w:p>
@@ -33,12 +30,12 @@
     </w:p>
     <w:p>
       <w:r>
-        <w:t>Local verification is complete: the saved final proof output records 280 of 280 checks passed, no failures, no skips, and all 14 local uAgent workflow scenarios passed. This is local evidence, not proof that a gateway transaction or the complete ASI:One flow works live.</w:t>
+        <w:t>Local verification records 280 of 280 checks passed, with zero failures or skips, plus 14 of 14 local uAgent workflows passed. The signed-in ASI:One customer chat also completed the full mock lifecycle and rendered the combined booking history. The payment was simulated and created no gateway charge; this does not establish any Stripe or Razorpay transaction.</w:t>
       </w:r>
     </w:p>
     <w:p>
       <w:r>
-        <w:t>The work began from repository commit bf708c2 after inspecting the latest remote version. Existing seed, registered agent identities, provider role names and architecture were preserved. No provider was contacted or joined. Changes are uncommitted and unpublished.</w:t>
+        <w:t>The changes were committed as 2e0cfea and pushed to origin/main. Existing seed, registered agent identities, provider role names and architecture were preserved. No provider was contacted or joined. Changes cover booking/payment lifecycle, provider/pilot operation, tests and documentation.</w:t>
       </w:r>
     </w:p>
     <w:p>
@@ -1195,7 +1192,7 @@
     </w:tbl>
     <w:p>
       <w:r>
-        <w:t>The pre-existing deliverables/ServiceSetu_Laptop_Handoff.docx was left unchanged. No commit or GitHub push was made.</w:t>
+        <w:t>The pre-existing deliverables/ServiceSetu_Laptop_Handoff.docx was left unchanged and excluded from the push. The private chat URL and recording status below are in this local handoff update only; they were not pushed.</w:t>
       </w:r>
     </w:p>
     <w:p>
@@ -1539,15 +1536,8 @@
             <w:vAlign w:val="center"/>
           </w:tcPr>
           <w:p>
-            <w:pPr>
-              <w:spacing w:after="20"/>
-            </w:pPr>
             <w:r>
-              <w:rPr>
-                <w:rFonts w:ascii="Arial" w:hAnsi="Arial"/>
-                <w:sz w:val="16"/>
-              </w:rPr>
-              <w:t>Incomplete live; replacement approval/confirmation/history not observed</w:t>
+              <w:t>Completed in signed-in chat: cancellation/reversal, fresh replacement approval, confirmation and 17-event history rendered</w:t>
             </w:r>
           </w:p>
         </w:tc>
@@ -1555,7 +1545,7 @@
     </w:tbl>
     <w:p>
       <w:r>
-        <w:t>The baseline 234-test suite passed after loopback socket access was enabled; four initial inbox HTTP errors were sandbox bind restrictions. The final proof run was performed after implementation and completed 280 scenarios in 25.164 seconds. Local API doubles and uAgent dispatch do not prove checkout rendering or gateway settlement.</w:t>
+        <w:t>The final proof command `.venv/bin/python -m servicesetu prove` exited 0. Its output reported 280 tests passed, zero failed, zero skipped, and 14 local uAgent workflows passed; artifacts/local/proof-results.json records passed=true and mesh=passed. Four provider-inbox HTTP tests first errored when sandbox policy denied loopback socket binding; the permission-enabled rerun passed all 280. Local proof is separate from rendered ASI:One UI and gateway transactions.</w:t>
       </w:r>
     </w:p>
     <w:p>
@@ -1568,12 +1558,30 @@
     </w:p>
     <w:p>
       <w:r>
-        <w:t>Rendered customer responses observed in the signed-in existing Concierge chat: provider comparison, quote review, simulated-payment confirmation, provider cancellation with “refunded / Simulated payment · no gateway charge”, and a same-constraint replacement option. The mock booking had a corresponding booking_confirmed event and later provider_cancelled and customer_cancelled events in SQLite; the payment row separately showed the mock rail as refunded. These backend records are independent evidence from the rendered cards.</w:t>
+        <w:t>Rendered in the signed-in ASI:One Concierge chat: eligible provider comparison; exact quote review; explicit customer approval; a confirmed INR 699 CoolCare AC booking paid as “Simulated payment · no gateway charge”; provider cancellation and simulated payment reversal; a same-constraint Breeze AC replacement offer at INR 749; fresh replacement quote review and explicit approval; replacement confirmation; and the complete 17-event IST history. Both offers used AC service in Indiranagar, Bengaluru, 24 October 2026 at 10:00 AM IST, under the INR 1,000 maximum. All provider records were fictional. The customer-facing cards and history were visibly rendered; backend database/proof events are separate corroborating records.</w:t>
       </w:r>
     </w:p>
     <w:p>
       <w:r>
-        <w:t>The replacement card was visible, but its quote expired before approval. A fresh recovery action created new request/quote/recovery records in the backend. The active mailbox repeatedly logged Almanac destination resolution/timeouts and failed Agentverse message delivery; the fresh reply did not render. Therefore no replacement approval or confirmation event was recorded, and no complete history response was observed. A later mock-mode run must use a fresh database/hold and an available Agentverse route.</w:t>
+        <w:t>The first replacement quote expired before approval and was never confirmed. The Concierge rejected that expired quote. A fresh customer request with the same service, area, appointment and budget produced an eligible new option and hold; the customer reviewed and approved the new quote within the hold. The final rendered history contains the original cancellation and payment reversal, fresh search, new approval and replacement confirmation.</w:t>
+      </w:r>
+    </w:p>
+    <w:p>
+      <w:pPr>
+        <w:pStyle w:val="Heading2"/>
+      </w:pPr>
+      <w:r>
+        <w:t>Live ASI:One evidence</w:t>
+      </w:r>
+    </w:p>
+    <w:p>
+      <w:r>
+        <w:t>Completed shared conversation link: stored in the ignored local file artifacts/local/ServiceSetu_Private_Demo_Handoff.docx. This public handoff copy summarizes the visible result without exposing the private chat URL.</w:t>
+      </w:r>
+    </w:p>
+    <w:p>
+      <w:r>
+        <w:t>The final visible customer response showed confirmed Breeze AC, INR 749.00, paid in simulated mode, followed by the complete chronological 17-event IST history. The chat URL is retained only in the ignored local evidence copy. No recording file was created: QuickTime Player showed “New Screen Recording” disabled while its open-file panel was active. A screen recording still needs to be made after enabling an available recording path.</w:t>
       </w:r>
     </w:p>
     <w:p>
@@ -1776,7 +1784,7 @@
     </w:p>
     <w:p>
       <w:r>
-        <w:t>Use a fresh database for each complete demo. Holds are short. The previous live replacement could not proceed because its offer had expired by the time it was selected for review; the runbook now calls for reviewing and approving the fresh offer while its hold is active. If Agentverse delivery is degraded, status/recover can only help when the route is available; local proof is not a substitute for observing the card in ASI:One.</w:t>
+        <w:t>Use a fresh database for each new demonstration. Holds are short: select Review quote and approve promptly; if one expires, the agent rejects it and the customer must request a fresh quote. The completed run followed this rule and never reused an expired approval. If Agentverse delivery is degraded, status/recover can help only when the route is available; local proof does not substitute for observing the card in ASI:One.</w:t>
       </w:r>
     </w:p>
     <w:p>
@@ -1823,7 +1831,7 @@
         <w:pStyle w:val="ListBullet"/>
       </w:pPr>
       <w:r>
-        <w:t>The live ASI:One replacement offer expired before approval; fresh recovery delivery timed out. Replacement approval, replacement confirmation and final history have not been observed live.</w:t>
+        <w:t>The all-in-chat ASI:One mock workflow is complete and rendered, including cancellation/reversal, fresh replacement approval, replacement confirmation and full history. Razorpay hosted checkout and Stripe embedded checkout remain unverified live. The full customer conversation stayed in ASI:One; no external payment page was used.</w:t>
       </w:r>
     </w:p>
     <w:p>
@@ -1847,7 +1855,7 @@
         <w:pStyle w:val="ListBullet"/>
       </w:pPr>
       <w:r>
-        <w:t>Completion, provider messaging and problem acknowledgement are implemented and locally tested; full live UI acceptance remains unobserved.</w:t>
+        <w:t>Provider messaging, completion confirmation and booking-linked problem reporting are implemented and locally tested; those three actions were not exercised in this live demonstration.</w:t>
       </w:r>
     </w:p>
     <w:p>
@@ -1855,12 +1863,12 @@
         <w:pStyle w:val="ListBullet"/>
       </w:pPr>
       <w:r>
-        <w:t>All changes remain local and uncommitted. Historical registration evidence from October 13 was not rechecked during finalization.</w:t>
+        <w:t>Source, tests and public documentation were committed as 2e0cfea and pushed to origin/main. This Word file has since been updated locally with the private chat link and latest evidence; that private update is not committed or pushed. Historical registration evidence from October 13 was not rechecked during finalization.</w:t>
       </w:r>
     </w:p>
     <w:p>
       <w:r>
-        <w:t>No actual gateway transaction, real service, real-provider verification, production readiness or GitHub publication is claimed.</w:t>
+        <w:t>No actual gateway transaction, real service, real-provider verification, production readiness or hackathon submission is claimed. The source commit was pushed to GitHub; this is not a hackathon submission.</w:t>
       </w:r>
     </w:p>
     <w:sectPr>
@@ -2625,16 +2633,13 @@
     <w:qFormat/>
     <w:rsid w:val="00FC693F"/>
     <w:pPr>
-      <w:pBdr>
-        <w:bottom w:val="single" w:sz="8" w:space="4" w:color="4F81BD" w:themeColor="accent1"/>
-      </w:pBdr>
       <w:spacing w:after="80" w:line="240" w:lineRule="auto" w:before="180"/>
       <w:contextualSpacing/>
     </w:pPr>
     <w:rPr>
       <w:rFonts w:asciiTheme="majorHAnsi" w:eastAsiaTheme="majorEastAsia" w:hAnsiTheme="majorHAnsi" w:cstheme="majorBidi" w:ascii="Arial" w:hAnsi="Arial"/>
       <w:b/>
-      <w:color w:val="17365D"/>
+      <w:color w:val="000000"/>
       <w:spacing w:val="5"/>
       <w:kern w:val="28"/>
       <w:sz w:val="50"/>

</xml_diff>